<commit_message>
fix(email): fix admin email title color
</commit_message>
<xml_diff>
--- a/szakdolgozat/Szakdolgozat_Sablon.docx
+++ b/szakdolgozat/Szakdolgozat_Sablon.docx
@@ -399,7 +399,7 @@
           <w:r>
             <w:fldChar w:fldCharType="separate"/>
           </w:r>
-          <w:hyperlink w:anchor="_Toc226659172" w:history="1">
+          <w:hyperlink w:anchor="_Toc226667796" w:history="1">
             <w:r>
               <w:rPr>
                 <w:rStyle w:val="Hiperhivatkozs"/>
@@ -444,7 +444,7 @@
                 <w:noProof/>
                 <w:webHidden/>
               </w:rPr>
-              <w:instrText xml:space="preserve"> PAGEREF _Toc226659172 \h </w:instrText>
+              <w:instrText xml:space="preserve"> PAGEREF _Toc226667796 \h </w:instrText>
             </w:r>
             <w:r>
               <w:rPr>
@@ -491,7 +491,7 @@
               <w14:ligatures w14:val="standardContextual"/>
             </w:rPr>
           </w:pPr>
-          <w:hyperlink w:anchor="_Toc226659173" w:history="1">
+          <w:hyperlink w:anchor="_Toc226667797" w:history="1">
             <w:r>
               <w:rPr>
                 <w:rStyle w:val="Hiperhivatkozs"/>
@@ -536,7 +536,7 @@
                 <w:noProof/>
                 <w:webHidden/>
               </w:rPr>
-              <w:instrText xml:space="preserve"> PAGEREF _Toc226659173 \h </w:instrText>
+              <w:instrText xml:space="preserve"> PAGEREF _Toc226667797 \h </w:instrText>
             </w:r>
             <w:r>
               <w:rPr>
@@ -583,7 +583,7 @@
               <w14:ligatures w14:val="standardContextual"/>
             </w:rPr>
           </w:pPr>
-          <w:hyperlink w:anchor="_Toc226659174" w:history="1">
+          <w:hyperlink w:anchor="_Toc226667798" w:history="1">
             <w:r>
               <w:rPr>
                 <w:rStyle w:val="Hiperhivatkozs"/>
@@ -628,7 +628,7 @@
                 <w:noProof/>
                 <w:webHidden/>
               </w:rPr>
-              <w:instrText xml:space="preserve"> PAGEREF _Toc226659174 \h </w:instrText>
+              <w:instrText xml:space="preserve"> PAGEREF _Toc226667798 \h </w:instrText>
             </w:r>
             <w:r>
               <w:rPr>
@@ -675,7 +675,7 @@
               <w14:ligatures w14:val="standardContextual"/>
             </w:rPr>
           </w:pPr>
-          <w:hyperlink w:anchor="_Toc226659175" w:history="1">
+          <w:hyperlink w:anchor="_Toc226667799" w:history="1">
             <w:r>
               <w:rPr>
                 <w:rStyle w:val="Hiperhivatkozs"/>
@@ -720,7 +720,7 @@
                 <w:noProof/>
                 <w:webHidden/>
               </w:rPr>
-              <w:instrText xml:space="preserve"> PAGEREF _Toc226659175 \h </w:instrText>
+              <w:instrText xml:space="preserve"> PAGEREF _Toc226667799 \h </w:instrText>
             </w:r>
             <w:r>
               <w:rPr>
@@ -767,7 +767,7 @@
               <w14:ligatures w14:val="standardContextual"/>
             </w:rPr>
           </w:pPr>
-          <w:hyperlink w:anchor="_Toc226659176" w:history="1">
+          <w:hyperlink w:anchor="_Toc226667800" w:history="1">
             <w:r>
               <w:rPr>
                 <w:rStyle w:val="Hiperhivatkozs"/>
@@ -812,7 +812,7 @@
                 <w:noProof/>
                 <w:webHidden/>
               </w:rPr>
-              <w:instrText xml:space="preserve"> PAGEREF _Toc226659176 \h </w:instrText>
+              <w:instrText xml:space="preserve"> PAGEREF _Toc226667800 \h </w:instrText>
             </w:r>
             <w:r>
               <w:rPr>
@@ -859,7 +859,7 @@
               <w14:ligatures w14:val="standardContextual"/>
             </w:rPr>
           </w:pPr>
-          <w:hyperlink w:anchor="_Toc226659177" w:history="1">
+          <w:hyperlink w:anchor="_Toc226667801" w:history="1">
             <w:r>
               <w:rPr>
                 <w:rStyle w:val="Hiperhivatkozs"/>
@@ -904,7 +904,7 @@
                 <w:noProof/>
                 <w:webHidden/>
               </w:rPr>
-              <w:instrText xml:space="preserve"> PAGEREF _Toc226659177 \h </w:instrText>
+              <w:instrText xml:space="preserve"> PAGEREF _Toc226667801 \h </w:instrText>
             </w:r>
             <w:r>
               <w:rPr>
@@ -951,7 +951,7 @@
               <w14:ligatures w14:val="standardContextual"/>
             </w:rPr>
           </w:pPr>
-          <w:hyperlink w:anchor="_Toc226659178" w:history="1">
+          <w:hyperlink w:anchor="_Toc226667802" w:history="1">
             <w:r>
               <w:rPr>
                 <w:rStyle w:val="Hiperhivatkozs"/>
@@ -996,7 +996,7 @@
                 <w:noProof/>
                 <w:webHidden/>
               </w:rPr>
-              <w:instrText xml:space="preserve"> PAGEREF _Toc226659178 \h </w:instrText>
+              <w:instrText xml:space="preserve"> PAGEREF _Toc226667802 \h </w:instrText>
             </w:r>
             <w:r>
               <w:rPr>
@@ -1043,7 +1043,7 @@
               <w14:ligatures w14:val="standardContextual"/>
             </w:rPr>
           </w:pPr>
-          <w:hyperlink w:anchor="_Toc226659179" w:history="1">
+          <w:hyperlink w:anchor="_Toc226667803" w:history="1">
             <w:r>
               <w:rPr>
                 <w:rStyle w:val="Hiperhivatkozs"/>
@@ -1088,7 +1088,7 @@
                 <w:noProof/>
                 <w:webHidden/>
               </w:rPr>
-              <w:instrText xml:space="preserve"> PAGEREF _Toc226659179 \h </w:instrText>
+              <w:instrText xml:space="preserve"> PAGEREF _Toc226667803 \h </w:instrText>
             </w:r>
             <w:r>
               <w:rPr>
@@ -1135,7 +1135,7 @@
               <w14:ligatures w14:val="standardContextual"/>
             </w:rPr>
           </w:pPr>
-          <w:hyperlink w:anchor="_Toc226659180" w:history="1">
+          <w:hyperlink w:anchor="_Toc226667804" w:history="1">
             <w:r>
               <w:rPr>
                 <w:rStyle w:val="Hiperhivatkozs"/>
@@ -1180,7 +1180,7 @@
                 <w:noProof/>
                 <w:webHidden/>
               </w:rPr>
-              <w:instrText xml:space="preserve"> PAGEREF _Toc226659180 \h </w:instrText>
+              <w:instrText xml:space="preserve"> PAGEREF _Toc226667804 \h </w:instrText>
             </w:r>
             <w:r>
               <w:rPr>
@@ -1227,7 +1227,7 @@
               <w14:ligatures w14:val="standardContextual"/>
             </w:rPr>
           </w:pPr>
-          <w:hyperlink w:anchor="_Toc226659181" w:history="1">
+          <w:hyperlink w:anchor="_Toc226667805" w:history="1">
             <w:r>
               <w:rPr>
                 <w:rStyle w:val="Hiperhivatkozs"/>
@@ -1272,7 +1272,7 @@
                 <w:noProof/>
                 <w:webHidden/>
               </w:rPr>
-              <w:instrText xml:space="preserve"> PAGEREF _Toc226659181 \h </w:instrText>
+              <w:instrText xml:space="preserve"> PAGEREF _Toc226667805 \h </w:instrText>
             </w:r>
             <w:r>
               <w:rPr>
@@ -1319,7 +1319,7 @@
               <w14:ligatures w14:val="standardContextual"/>
             </w:rPr>
           </w:pPr>
-          <w:hyperlink w:anchor="_Toc226659182" w:history="1">
+          <w:hyperlink w:anchor="_Toc226667806" w:history="1">
             <w:r>
               <w:rPr>
                 <w:rStyle w:val="Hiperhivatkozs"/>
@@ -1364,7 +1364,7 @@
                 <w:noProof/>
                 <w:webHidden/>
               </w:rPr>
-              <w:instrText xml:space="preserve"> PAGEREF _Toc226659182 \h </w:instrText>
+              <w:instrText xml:space="preserve"> PAGEREF _Toc226667806 \h </w:instrText>
             </w:r>
             <w:r>
               <w:rPr>
@@ -1411,7 +1411,7 @@
               <w14:ligatures w14:val="standardContextual"/>
             </w:rPr>
           </w:pPr>
-          <w:hyperlink w:anchor="_Toc226659183" w:history="1">
+          <w:hyperlink w:anchor="_Toc226667807" w:history="1">
             <w:r>
               <w:rPr>
                 <w:rStyle w:val="Hiperhivatkozs"/>
@@ -1456,7 +1456,7 @@
                 <w:noProof/>
                 <w:webHidden/>
               </w:rPr>
-              <w:instrText xml:space="preserve"> PAGEREF _Toc226659183 \h </w:instrText>
+              <w:instrText xml:space="preserve"> PAGEREF _Toc226667807 \h </w:instrText>
             </w:r>
             <w:r>
               <w:rPr>
@@ -1503,7 +1503,7 @@
               <w14:ligatures w14:val="standardContextual"/>
             </w:rPr>
           </w:pPr>
-          <w:hyperlink w:anchor="_Toc226659184" w:history="1">
+          <w:hyperlink w:anchor="_Toc226667808" w:history="1">
             <w:r>
               <w:rPr>
                 <w:rStyle w:val="Hiperhivatkozs"/>
@@ -1548,7 +1548,7 @@
                 <w:noProof/>
                 <w:webHidden/>
               </w:rPr>
-              <w:instrText xml:space="preserve"> PAGEREF _Toc226659184 \h </w:instrText>
+              <w:instrText xml:space="preserve"> PAGEREF _Toc226667808 \h </w:instrText>
             </w:r>
             <w:r>
               <w:rPr>
@@ -1595,7 +1595,7 @@
               <w14:ligatures w14:val="standardContextual"/>
             </w:rPr>
           </w:pPr>
-          <w:hyperlink w:anchor="_Toc226659185" w:history="1">
+          <w:hyperlink w:anchor="_Toc226667809" w:history="1">
             <w:r>
               <w:rPr>
                 <w:rStyle w:val="Hiperhivatkozs"/>
@@ -1640,7 +1640,7 @@
                 <w:noProof/>
                 <w:webHidden/>
               </w:rPr>
-              <w:instrText xml:space="preserve"> PAGEREF _Toc226659185 \h </w:instrText>
+              <w:instrText xml:space="preserve"> PAGEREF _Toc226667809 \h </w:instrText>
             </w:r>
             <w:r>
               <w:rPr>
@@ -1687,7 +1687,7 @@
               <w14:ligatures w14:val="standardContextual"/>
             </w:rPr>
           </w:pPr>
-          <w:hyperlink w:anchor="_Toc226659186" w:history="1">
+          <w:hyperlink w:anchor="_Toc226667810" w:history="1">
             <w:r>
               <w:rPr>
                 <w:rStyle w:val="Hiperhivatkozs"/>
@@ -1732,7 +1732,7 @@
                 <w:noProof/>
                 <w:webHidden/>
               </w:rPr>
-              <w:instrText xml:space="preserve"> PAGEREF _Toc226659186 \h </w:instrText>
+              <w:instrText xml:space="preserve"> PAGEREF _Toc226667810 \h </w:instrText>
             </w:r>
             <w:r>
               <w:rPr>
@@ -1779,7 +1779,7 @@
               <w14:ligatures w14:val="standardContextual"/>
             </w:rPr>
           </w:pPr>
-          <w:hyperlink w:anchor="_Toc226659187" w:history="1">
+          <w:hyperlink w:anchor="_Toc226667811" w:history="1">
             <w:r>
               <w:rPr>
                 <w:rStyle w:val="Hiperhivatkozs"/>
@@ -1824,7 +1824,7 @@
                 <w:noProof/>
                 <w:webHidden/>
               </w:rPr>
-              <w:instrText xml:space="preserve"> PAGEREF _Toc226659187 \h </w:instrText>
+              <w:instrText xml:space="preserve"> PAGEREF _Toc226667811 \h </w:instrText>
             </w:r>
             <w:r>
               <w:rPr>
@@ -1871,7 +1871,7 @@
               <w14:ligatures w14:val="standardContextual"/>
             </w:rPr>
           </w:pPr>
-          <w:hyperlink w:anchor="_Toc226659188" w:history="1">
+          <w:hyperlink w:anchor="_Toc226667812" w:history="1">
             <w:r>
               <w:rPr>
                 <w:rStyle w:val="Hiperhivatkozs"/>
@@ -1916,7 +1916,7 @@
                 <w:noProof/>
                 <w:webHidden/>
               </w:rPr>
-              <w:instrText xml:space="preserve"> PAGEREF _Toc226659188 \h </w:instrText>
+              <w:instrText xml:space="preserve"> PAGEREF _Toc226667812 \h </w:instrText>
             </w:r>
             <w:r>
               <w:rPr>
@@ -1963,7 +1963,7 @@
               <w14:ligatures w14:val="standardContextual"/>
             </w:rPr>
           </w:pPr>
-          <w:hyperlink w:anchor="_Toc226659189" w:history="1">
+          <w:hyperlink w:anchor="_Toc226667813" w:history="1">
             <w:r>
               <w:rPr>
                 <w:rStyle w:val="Hiperhivatkozs"/>
@@ -2008,7 +2008,7 @@
                 <w:noProof/>
                 <w:webHidden/>
               </w:rPr>
-              <w:instrText xml:space="preserve"> PAGEREF _Toc226659189 \h </w:instrText>
+              <w:instrText xml:space="preserve"> PAGEREF _Toc226667813 \h </w:instrText>
             </w:r>
             <w:r>
               <w:rPr>
@@ -2055,7 +2055,7 @@
               <w14:ligatures w14:val="standardContextual"/>
             </w:rPr>
           </w:pPr>
-          <w:hyperlink w:anchor="_Toc226659190" w:history="1">
+          <w:hyperlink w:anchor="_Toc226667814" w:history="1">
             <w:r>
               <w:rPr>
                 <w:rStyle w:val="Hiperhivatkozs"/>
@@ -2100,7 +2100,7 @@
                 <w:noProof/>
                 <w:webHidden/>
               </w:rPr>
-              <w:instrText xml:space="preserve"> PAGEREF _Toc226659190 \h </w:instrText>
+              <w:instrText xml:space="preserve"> PAGEREF _Toc226667814 \h </w:instrText>
             </w:r>
             <w:r>
               <w:rPr>
@@ -2147,7 +2147,7 @@
               <w14:ligatures w14:val="standardContextual"/>
             </w:rPr>
           </w:pPr>
-          <w:hyperlink w:anchor="_Toc226659191" w:history="1">
+          <w:hyperlink w:anchor="_Toc226667815" w:history="1">
             <w:r>
               <w:rPr>
                 <w:rStyle w:val="Hiperhivatkozs"/>
@@ -2192,7 +2192,7 @@
                 <w:noProof/>
                 <w:webHidden/>
               </w:rPr>
-              <w:instrText xml:space="preserve"> PAGEREF _Toc226659191 \h </w:instrText>
+              <w:instrText xml:space="preserve"> PAGEREF _Toc226667815 \h </w:instrText>
             </w:r>
             <w:r>
               <w:rPr>
@@ -2239,7 +2239,7 @@
               <w14:ligatures w14:val="standardContextual"/>
             </w:rPr>
           </w:pPr>
-          <w:hyperlink w:anchor="_Toc226659192" w:history="1">
+          <w:hyperlink w:anchor="_Toc226667816" w:history="1">
             <w:r>
               <w:rPr>
                 <w:rStyle w:val="Hiperhivatkozs"/>
@@ -2284,7 +2284,7 @@
                 <w:noProof/>
                 <w:webHidden/>
               </w:rPr>
-              <w:instrText xml:space="preserve"> PAGEREF _Toc226659192 \h </w:instrText>
+              <w:instrText xml:space="preserve"> PAGEREF _Toc226667816 \h </w:instrText>
             </w:r>
             <w:r>
               <w:rPr>
@@ -2331,7 +2331,7 @@
               <w14:ligatures w14:val="standardContextual"/>
             </w:rPr>
           </w:pPr>
-          <w:hyperlink w:anchor="_Toc226659193" w:history="1">
+          <w:hyperlink w:anchor="_Toc226667817" w:history="1">
             <w:r>
               <w:rPr>
                 <w:rStyle w:val="Hiperhivatkozs"/>
@@ -2376,7 +2376,7 @@
                 <w:noProof/>
                 <w:webHidden/>
               </w:rPr>
-              <w:instrText xml:space="preserve"> PAGEREF _Toc226659193 \h </w:instrText>
+              <w:instrText xml:space="preserve"> PAGEREF _Toc226667817 \h </w:instrText>
             </w:r>
             <w:r>
               <w:rPr>
@@ -2423,7 +2423,7 @@
               <w14:ligatures w14:val="standardContextual"/>
             </w:rPr>
           </w:pPr>
-          <w:hyperlink w:anchor="_Toc226659194" w:history="1">
+          <w:hyperlink w:anchor="_Toc226667818" w:history="1">
             <w:r>
               <w:rPr>
                 <w:rStyle w:val="Hiperhivatkozs"/>
@@ -2468,7 +2468,7 @@
                 <w:noProof/>
                 <w:webHidden/>
               </w:rPr>
-              <w:instrText xml:space="preserve"> PAGEREF _Toc226659194 \h </w:instrText>
+              <w:instrText xml:space="preserve"> PAGEREF _Toc226667818 \h </w:instrText>
             </w:r>
             <w:r>
               <w:rPr>
@@ -2515,7 +2515,7 @@
               <w14:ligatures w14:val="standardContextual"/>
             </w:rPr>
           </w:pPr>
-          <w:hyperlink w:anchor="_Toc226659195" w:history="1">
+          <w:hyperlink w:anchor="_Toc226667819" w:history="1">
             <w:r>
               <w:rPr>
                 <w:rStyle w:val="Hiperhivatkozs"/>
@@ -2560,7 +2560,7 @@
                 <w:noProof/>
                 <w:webHidden/>
               </w:rPr>
-              <w:instrText xml:space="preserve"> PAGEREF _Toc226659195 \h </w:instrText>
+              <w:instrText xml:space="preserve"> PAGEREF _Toc226667819 \h </w:instrText>
             </w:r>
             <w:r>
               <w:rPr>
@@ -2607,7 +2607,7 @@
               <w14:ligatures w14:val="standardContextual"/>
             </w:rPr>
           </w:pPr>
-          <w:hyperlink w:anchor="_Toc226659196" w:history="1">
+          <w:hyperlink w:anchor="_Toc226667820" w:history="1">
             <w:r>
               <w:rPr>
                 <w:rStyle w:val="Hiperhivatkozs"/>
@@ -2652,7 +2652,7 @@
                 <w:noProof/>
                 <w:webHidden/>
               </w:rPr>
-              <w:instrText xml:space="preserve"> PAGEREF _Toc226659196 \h </w:instrText>
+              <w:instrText xml:space="preserve"> PAGEREF _Toc226667820 \h </w:instrText>
             </w:r>
             <w:r>
               <w:rPr>
@@ -2673,6 +2673,190 @@
                 <w:webHidden/>
               </w:rPr>
               <w:t>20</w:t>
+            </w:r>
+            <w:r>
+              <w:rPr>
+                <w:noProof/>
+                <w:webHidden/>
+              </w:rPr>
+              <w:fldChar w:fldCharType="end"/>
+            </w:r>
+          </w:hyperlink>
+        </w:p>
+        <w:p>
+          <w:pPr>
+            <w:pStyle w:val="TJ3"/>
+            <w:tabs>
+              <w:tab w:val="left" w:pos="1440"/>
+              <w:tab w:val="right" w:leader="dot" w:pos="9062"/>
+            </w:tabs>
+            <w:rPr>
+              <w:rFonts w:eastAsiaTheme="minorEastAsia"/>
+              <w:noProof/>
+              <w:kern w:val="2"/>
+              <w:szCs w:val="24"/>
+              <w:lang w:eastAsia="hu-HU"/>
+              <w14:ligatures w14:val="standardContextual"/>
+            </w:rPr>
+          </w:pPr>
+          <w:hyperlink w:anchor="_Toc226667821" w:history="1">
+            <w:r>
+              <w:rPr>
+                <w:rStyle w:val="Hiperhivatkozs"/>
+                <w:noProof/>
+              </w:rPr>
+              <w:t>3.3.2.</w:t>
+            </w:r>
+            <w:r>
+              <w:rPr>
+                <w:rFonts w:eastAsiaTheme="minorEastAsia"/>
+                <w:noProof/>
+                <w:kern w:val="2"/>
+                <w:szCs w:val="24"/>
+                <w:lang w:eastAsia="hu-HU"/>
+                <w14:ligatures w14:val="standardContextual"/>
+              </w:rPr>
+              <w:tab/>
+            </w:r>
+            <w:r>
+              <w:rPr>
+                <w:rStyle w:val="Hiperhivatkozs"/>
+                <w:noProof/>
+              </w:rPr>
+              <w:t>Adatbázis-migrációk és az Eloquent ORM a gyakorlatban</w:t>
+            </w:r>
+            <w:r>
+              <w:rPr>
+                <w:noProof/>
+                <w:webHidden/>
+              </w:rPr>
+              <w:tab/>
+            </w:r>
+            <w:r>
+              <w:rPr>
+                <w:noProof/>
+                <w:webHidden/>
+              </w:rPr>
+              <w:fldChar w:fldCharType="begin"/>
+            </w:r>
+            <w:r>
+              <w:rPr>
+                <w:noProof/>
+                <w:webHidden/>
+              </w:rPr>
+              <w:instrText xml:space="preserve"> PAGEREF _Toc226667821 \h </w:instrText>
+            </w:r>
+            <w:r>
+              <w:rPr>
+                <w:noProof/>
+                <w:webHidden/>
+              </w:rPr>
+            </w:r>
+            <w:r>
+              <w:rPr>
+                <w:noProof/>
+                <w:webHidden/>
+              </w:rPr>
+              <w:fldChar w:fldCharType="separate"/>
+            </w:r>
+            <w:r>
+              <w:rPr>
+                <w:noProof/>
+                <w:webHidden/>
+              </w:rPr>
+              <w:t>21</w:t>
+            </w:r>
+            <w:r>
+              <w:rPr>
+                <w:noProof/>
+                <w:webHidden/>
+              </w:rPr>
+              <w:fldChar w:fldCharType="end"/>
+            </w:r>
+          </w:hyperlink>
+        </w:p>
+        <w:p>
+          <w:pPr>
+            <w:pStyle w:val="TJ3"/>
+            <w:tabs>
+              <w:tab w:val="left" w:pos="1440"/>
+              <w:tab w:val="right" w:leader="dot" w:pos="9062"/>
+            </w:tabs>
+            <w:rPr>
+              <w:rFonts w:eastAsiaTheme="minorEastAsia"/>
+              <w:noProof/>
+              <w:kern w:val="2"/>
+              <w:szCs w:val="24"/>
+              <w:lang w:eastAsia="hu-HU"/>
+              <w14:ligatures w14:val="standardContextual"/>
+            </w:rPr>
+          </w:pPr>
+          <w:hyperlink w:anchor="_Toc226667822" w:history="1">
+            <w:r>
+              <w:rPr>
+                <w:rStyle w:val="Hiperhivatkozs"/>
+                <w:noProof/>
+              </w:rPr>
+              <w:t>3.3.3.</w:t>
+            </w:r>
+            <w:r>
+              <w:rPr>
+                <w:rFonts w:eastAsiaTheme="minorEastAsia"/>
+                <w:noProof/>
+                <w:kern w:val="2"/>
+                <w:szCs w:val="24"/>
+                <w:lang w:eastAsia="hu-HU"/>
+                <w14:ligatures w14:val="standardContextual"/>
+              </w:rPr>
+              <w:tab/>
+            </w:r>
+            <w:r>
+              <w:rPr>
+                <w:rStyle w:val="Hiperhivatkozs"/>
+                <w:noProof/>
+              </w:rPr>
+              <w:t>Adatintegritás, GDPR és a törlési stratégiák</w:t>
+            </w:r>
+            <w:r>
+              <w:rPr>
+                <w:noProof/>
+                <w:webHidden/>
+              </w:rPr>
+              <w:tab/>
+            </w:r>
+            <w:r>
+              <w:rPr>
+                <w:noProof/>
+                <w:webHidden/>
+              </w:rPr>
+              <w:fldChar w:fldCharType="begin"/>
+            </w:r>
+            <w:r>
+              <w:rPr>
+                <w:noProof/>
+                <w:webHidden/>
+              </w:rPr>
+              <w:instrText xml:space="preserve"> PAGEREF _Toc226667822 \h </w:instrText>
+            </w:r>
+            <w:r>
+              <w:rPr>
+                <w:noProof/>
+                <w:webHidden/>
+              </w:rPr>
+            </w:r>
+            <w:r>
+              <w:rPr>
+                <w:noProof/>
+                <w:webHidden/>
+              </w:rPr>
+              <w:fldChar w:fldCharType="separate"/>
+            </w:r>
+            <w:r>
+              <w:rPr>
+                <w:noProof/>
+                <w:webHidden/>
+              </w:rPr>
+              <w:t>22</w:t>
             </w:r>
             <w:r>
               <w:rPr>
@@ -2699,7 +2883,7 @@
               <w14:ligatures w14:val="standardContextual"/>
             </w:rPr>
           </w:pPr>
-          <w:hyperlink w:anchor="_Toc226659197" w:history="1">
+          <w:hyperlink w:anchor="_Toc226667823" w:history="1">
             <w:r>
               <w:rPr>
                 <w:rStyle w:val="Hiperhivatkozs"/>
@@ -2744,7 +2928,7 @@
                 <w:noProof/>
                 <w:webHidden/>
               </w:rPr>
-              <w:instrText xml:space="preserve"> PAGEREF _Toc226659197 \h </w:instrText>
+              <w:instrText xml:space="preserve"> PAGEREF _Toc226667823 \h </w:instrText>
             </w:r>
             <w:r>
               <w:rPr>
@@ -2764,7 +2948,7 @@
                 <w:noProof/>
                 <w:webHidden/>
               </w:rPr>
-              <w:t>21</w:t>
+              <w:t>24</w:t>
             </w:r>
             <w:r>
               <w:rPr>
@@ -2791,7 +2975,7 @@
               <w14:ligatures w14:val="standardContextual"/>
             </w:rPr>
           </w:pPr>
-          <w:hyperlink w:anchor="_Toc226659198" w:history="1">
+          <w:hyperlink w:anchor="_Toc226667824" w:history="1">
             <w:r>
               <w:rPr>
                 <w:rStyle w:val="Hiperhivatkozs"/>
@@ -2836,7 +3020,7 @@
                 <w:noProof/>
                 <w:webHidden/>
               </w:rPr>
-              <w:instrText xml:space="preserve"> PAGEREF _Toc226659198 \h </w:instrText>
+              <w:instrText xml:space="preserve"> PAGEREF _Toc226667824 \h </w:instrText>
             </w:r>
             <w:r>
               <w:rPr>
@@ -2856,7 +3040,7 @@
                 <w:noProof/>
                 <w:webHidden/>
               </w:rPr>
-              <w:t>22</w:t>
+              <w:t>25</w:t>
             </w:r>
             <w:r>
               <w:rPr>
@@ -2883,7 +3067,7 @@
               <w14:ligatures w14:val="standardContextual"/>
             </w:rPr>
           </w:pPr>
-          <w:hyperlink w:anchor="_Toc226659199" w:history="1">
+          <w:hyperlink w:anchor="_Toc226667825" w:history="1">
             <w:r>
               <w:rPr>
                 <w:rStyle w:val="Hiperhivatkozs"/>
@@ -2928,7 +3112,7 @@
                 <w:noProof/>
                 <w:webHidden/>
               </w:rPr>
-              <w:instrText xml:space="preserve"> PAGEREF _Toc226659199 \h </w:instrText>
+              <w:instrText xml:space="preserve"> PAGEREF _Toc226667825 \h </w:instrText>
             </w:r>
             <w:r>
               <w:rPr>
@@ -2948,7 +3132,7 @@
                 <w:noProof/>
                 <w:webHidden/>
               </w:rPr>
-              <w:t>23</w:t>
+              <w:t>26</w:t>
             </w:r>
             <w:r>
               <w:rPr>
@@ -2982,7 +3166,7 @@
       <w:pPr>
         <w:pStyle w:val="Cmsor1"/>
       </w:pPr>
-      <w:bookmarkStart w:id="3" w:name="_Toc226659172"/>
+      <w:bookmarkStart w:id="3" w:name="_Toc226667796"/>
       <w:r>
         <w:lastRenderedPageBreak/>
         <w:t>Bevezet</w:t>
@@ -3133,7 +3317,7 @@
       <w:pPr>
         <w:pStyle w:val="Cmsor1"/>
       </w:pPr>
-      <w:bookmarkStart w:id="4" w:name="_Toc226659173"/>
+      <w:bookmarkStart w:id="4" w:name="_Toc226667797"/>
       <w:r>
         <w:lastRenderedPageBreak/>
         <w:t>Felhasználói dokumentáció</w:t>
@@ -3144,7 +3328,7 @@
       <w:pPr>
         <w:pStyle w:val="Cmsor2"/>
       </w:pPr>
-      <w:bookmarkStart w:id="5" w:name="_Toc226659174"/>
+      <w:bookmarkStart w:id="5" w:name="_Toc226667798"/>
       <w:r>
         <w:t xml:space="preserve">Rendszerkövetelmények és </w:t>
       </w:r>
@@ -3206,7 +3390,7 @@
       <w:pPr>
         <w:pStyle w:val="Cmsor2"/>
       </w:pPr>
-      <w:bookmarkStart w:id="6" w:name="_Toc226659175"/>
+      <w:bookmarkStart w:id="6" w:name="_Toc226667799"/>
       <w:r>
         <w:t>A publikus felület (Vendég nézet):</w:t>
       </w:r>
@@ -3216,7 +3400,7 @@
       <w:pPr>
         <w:pStyle w:val="Cmsor3"/>
       </w:pPr>
-      <w:bookmarkStart w:id="7" w:name="_Toc226659176"/>
+      <w:bookmarkStart w:id="7" w:name="_Toc226667800"/>
       <w:r>
         <w:t>Navigáció és információs oldalak bemutatás</w:t>
       </w:r>
@@ -3985,7 +4169,7 @@
       <w:pPr>
         <w:pStyle w:val="Cmsor3"/>
       </w:pPr>
-      <w:bookmarkStart w:id="11" w:name="_Toc226659177"/>
+      <w:bookmarkStart w:id="11" w:name="_Toc226667801"/>
       <w:r>
         <w:t>A foglalás menete</w:t>
       </w:r>
@@ -4646,7 +4830,7 @@
       <w:pPr>
         <w:pStyle w:val="Cmsor2"/>
       </w:pPr>
-      <w:bookmarkStart w:id="14" w:name="_Toc226659178"/>
+      <w:bookmarkStart w:id="14" w:name="_Toc226667802"/>
       <w:r>
         <w:lastRenderedPageBreak/>
         <w:t>Az Adminisztrációs felület bemutatása</w:t>
@@ -4719,7 +4903,7 @@
       <w:pPr>
         <w:pStyle w:val="Cmsor3"/>
       </w:pPr>
-      <w:bookmarkStart w:id="15" w:name="_Toc226659179"/>
+      <w:bookmarkStart w:id="15" w:name="_Toc226667803"/>
       <w:r>
         <w:t>Hitelesítés és biztonság (Bejelentkezés)</w:t>
       </w:r>
@@ -4889,7 +5073,7 @@
       <w:pPr>
         <w:pStyle w:val="Cmsor3"/>
       </w:pPr>
-      <w:bookmarkStart w:id="17" w:name="_Toc226659180"/>
+      <w:bookmarkStart w:id="17" w:name="_Toc226667804"/>
       <w:r>
         <w:t>Vezérlőpult (Dashboard) és Foglalások kezelése</w:t>
       </w:r>
@@ -5429,7 +5613,7 @@
       <w:pPr>
         <w:pStyle w:val="Cmsor3"/>
       </w:pPr>
-      <w:bookmarkStart w:id="21" w:name="_Toc226659181"/>
+      <w:bookmarkStart w:id="21" w:name="_Toc226667805"/>
       <w:r>
         <w:t>Globális beállítások és árak dinamikus kezelése</w:t>
       </w:r>
@@ -5718,7 +5902,7 @@
       <w:pPr>
         <w:pStyle w:val="Cmsor3"/>
       </w:pPr>
-      <w:bookmarkStart w:id="23" w:name="_Toc226659182"/>
+      <w:bookmarkStart w:id="23" w:name="_Toc226667806"/>
       <w:r>
         <w:t>Tartalomkezelés (Galéria és Szobák)</w:t>
       </w:r>
@@ -5968,7 +6152,7 @@
       <w:pPr>
         <w:pStyle w:val="Cmsor1"/>
       </w:pPr>
-      <w:bookmarkStart w:id="25" w:name="_Toc226659183"/>
+      <w:bookmarkStart w:id="25" w:name="_Toc226667807"/>
       <w:r>
         <w:lastRenderedPageBreak/>
         <w:t>Fejlesztői dokumentáció</w:t>
@@ -5979,7 +6163,7 @@
       <w:pPr>
         <w:pStyle w:val="Cmsor2"/>
       </w:pPr>
-      <w:bookmarkStart w:id="26" w:name="_Toc226659184"/>
+      <w:bookmarkStart w:id="26" w:name="_Toc226667808"/>
       <w:r>
         <w:t>Felhasznált technológiák és fejlesztői környezet</w:t>
       </w:r>
@@ -5989,7 +6173,7 @@
       <w:pPr>
         <w:pStyle w:val="Cmsor3"/>
       </w:pPr>
-      <w:bookmarkStart w:id="27" w:name="_Toc226659185"/>
+      <w:bookmarkStart w:id="27" w:name="_Toc226667809"/>
       <w:r>
         <w:t>Fejlesztői környezet és verziókezelés</w:t>
       </w:r>
@@ -6201,7 +6385,7 @@
       <w:pPr>
         <w:pStyle w:val="Cmsor3"/>
       </w:pPr>
-      <w:bookmarkStart w:id="28" w:name="_Toc226659186"/>
+      <w:bookmarkStart w:id="28" w:name="_Toc226667810"/>
       <w:r>
         <w:t>Szerveroldali technológiák</w:t>
       </w:r>
@@ -6640,7 +6824,7 @@
       <w:pPr>
         <w:pStyle w:val="Cmsor3"/>
       </w:pPr>
-      <w:bookmarkStart w:id="29" w:name="_Toc226659187"/>
+      <w:bookmarkStart w:id="29" w:name="_Toc226667811"/>
       <w:r>
         <w:t>Adatbázis-kezelés</w:t>
       </w:r>
@@ -6839,7 +7023,7 @@
       <w:pPr>
         <w:pStyle w:val="Cmsor3"/>
       </w:pPr>
-      <w:bookmarkStart w:id="30" w:name="_Toc226659188"/>
+      <w:bookmarkStart w:id="30" w:name="_Toc226667812"/>
       <w:r>
         <w:t>Kliensoldali technológiák</w:t>
       </w:r>
@@ -7023,7 +7207,7 @@
       <w:pPr>
         <w:pStyle w:val="Cmsor3"/>
       </w:pPr>
-      <w:bookmarkStart w:id="31" w:name="_Toc226659189"/>
+      <w:bookmarkStart w:id="31" w:name="_Toc226667813"/>
       <w:r>
         <w:lastRenderedPageBreak/>
         <w:t>Felhasználói felület és prototipizálás</w:t>
@@ -7343,7 +7527,7 @@
       <w:pPr>
         <w:pStyle w:val="Cmsor2"/>
       </w:pPr>
-      <w:bookmarkStart w:id="33" w:name="_Toc226659190"/>
+      <w:bookmarkStart w:id="33" w:name="_Toc226667814"/>
       <w:r>
         <w:t>Rendszerarchitektúra és Üzleti logika</w:t>
       </w:r>
@@ -7353,7 +7537,7 @@
       <w:pPr>
         <w:pStyle w:val="Cmsor3"/>
       </w:pPr>
-      <w:bookmarkStart w:id="34" w:name="_Toc226659191"/>
+      <w:bookmarkStart w:id="34" w:name="_Toc226667815"/>
       <w:r>
         <w:t>Az MVC architekturális minta a gyakorlatban</w:t>
       </w:r>
@@ -7550,7 +7734,7 @@
       <w:pPr>
         <w:pStyle w:val="Cmsor3"/>
       </w:pPr>
-      <w:bookmarkStart w:id="35" w:name="_Toc226659192"/>
+      <w:bookmarkStart w:id="35" w:name="_Toc226667816"/>
       <w:r>
         <w:t>Az üzleti logika és a Service réteg</w:t>
       </w:r>
@@ -8016,7 +8200,7 @@
       <w:pPr>
         <w:pStyle w:val="Cmsor3"/>
       </w:pPr>
-      <w:bookmarkStart w:id="37" w:name="_Toc226659193"/>
+      <w:bookmarkStart w:id="37" w:name="_Toc226667817"/>
       <w:r>
         <w:t>Dinamikus árkalkuláció</w:t>
       </w:r>
@@ -8582,7 +8766,7 @@
       <w:pPr>
         <w:pStyle w:val="Cmsor3"/>
       </w:pPr>
-      <w:bookmarkStart w:id="39" w:name="_Toc226659194"/>
+      <w:bookmarkStart w:id="39" w:name="_Toc226667818"/>
       <w:r>
         <w:t>Útválasztás (Routing) és Köztesrétegek (Middleware)</w:t>
       </w:r>
@@ -8817,7 +9001,7 @@
       <w:pPr>
         <w:pStyle w:val="Cmsor2"/>
       </w:pPr>
-      <w:bookmarkStart w:id="40" w:name="_Toc226659195"/>
+      <w:bookmarkStart w:id="40" w:name="_Toc226667819"/>
       <w:r>
         <w:t>Adatbázis-tervezés és Adatkezelés</w:t>
       </w:r>
@@ -8827,7 +9011,7 @@
       <w:pPr>
         <w:pStyle w:val="Cmsor3"/>
       </w:pPr>
-      <w:bookmarkStart w:id="41" w:name="_Toc226659196"/>
+      <w:bookmarkStart w:id="41" w:name="_Toc226667820"/>
       <w:r>
         <w:t>Relációs adatmodell és ER-diagram</w:t>
       </w:r>
@@ -9086,9 +9270,11 @@
       <w:pPr>
         <w:pStyle w:val="Cmsor3"/>
       </w:pPr>
+      <w:bookmarkStart w:id="43" w:name="_Toc226667821"/>
       <w:r>
         <w:t>Adatbázis-migrációk és az Eloquent ORM a gyakorlatban</w:t>
       </w:r>
+      <w:bookmarkEnd w:id="43"/>
     </w:p>
     <w:p>
       <w:r>
@@ -9124,186 +9310,66 @@
         <w:t>dattípus kiválasztása mennyiségeknél és áraknál</w:t>
       </w:r>
       <w:r>
+        <w:t xml:space="preserve">. A </w:t>
+      </w:r>
+      <w:r>
+        <w:lastRenderedPageBreak/>
+        <w:t xml:space="preserve">mennyiséget vagy árat mutató adatoknál előjel nélküli egész (unsignedInteger) adattípust alkalmaztam, mert ezek nem vehetnek fel negatív értéket, ezzel is </w:t>
+      </w:r>
+      <w:r>
+        <w:t>további adatbázis-szintű védelmet biztosítva</w:t>
+      </w:r>
+      <w:r>
+        <w:t xml:space="preserve"> a programomnak. </w:t>
+      </w:r>
+    </w:p>
+    <w:p>
+      <w:r>
+        <w:t xml:space="preserve">Továbbá a globális változóknál </w:t>
+      </w:r>
+      <w:r>
+        <w:t>Kulcs-Érték</w:t>
+      </w:r>
+      <w:r>
+        <w:t xml:space="preserve"> (</w:t>
+      </w:r>
+      <w:r>
+        <w:t>Key-Value</w:t>
+      </w:r>
+      <w:r>
+        <w:t>)</w:t>
+      </w:r>
+      <w:r>
+        <w:t xml:space="preserve"> adattárolási mint</w:t>
+      </w:r>
+      <w:r>
+        <w:t>át alkalmaztam. Így tehát például a fűtés kapcsoló, vagy a telefonszám nem egyetlen sorból álló hagyományos táblában tárolódik, hanem egy Key-Value struktúrájú site_settings táblában, ahol a key a PRIMARY KEY. Ez praktikus, ha új globális beállítást szeretnék a későbbiekben hozzáadni – nem lesz szükség új egyéni oszlopra.</w:t>
+      </w:r>
+      <w:r>
+        <w:t xml:space="preserve"> Ennek megfelelő működéséhez a </w:t>
+      </w:r>
+      <w:r>
+        <w:t>SiteSetting modell konfigurációjában</w:t>
+      </w:r>
+      <w:r>
+        <w:t xml:space="preserve"> is explicit módon felül kellett írnom</w:t>
+      </w:r>
+      <w:r>
+        <w:t xml:space="preserve"> a keretrendszer alapértelmezett viselkedését</w:t>
+      </w:r>
+      <w:r>
+        <w:t xml:space="preserve">, máskülönben </w:t>
+      </w:r>
+      <w:r>
+        <w:t>az ORM hibás SQL lekérdezéseket generált volna</w:t>
+      </w:r>
+      <w:r>
         <w:t xml:space="preserve">. </w:t>
       </w:r>
-      <w:r>
-        <w:t xml:space="preserve">A </w:t>
-      </w:r>
-      <w:r>
-        <w:lastRenderedPageBreak/>
-        <w:t xml:space="preserve">mennyiséget vagy árat mutató adatoknál </w:t>
-      </w:r>
-      <w:r>
-        <w:t>előjel nélküli egész (</w:t>
-      </w:r>
-      <w:r>
-        <w:t>unsigned</w:t>
-      </w:r>
-      <w:r>
-        <w:t>I</w:t>
-      </w:r>
-      <w:r>
-        <w:t>nteger</w:t>
-      </w:r>
-      <w:r>
-        <w:t>)</w:t>
-      </w:r>
-      <w:r>
-        <w:t xml:space="preserve"> adattípust alkalmaztam</w:t>
-      </w:r>
-      <w:r>
-        <w:t>, mert e</w:t>
-      </w:r>
-      <w:r>
-        <w:t>zek nem vehetnek fel negatív értéket</w:t>
-      </w:r>
-      <w:r>
-        <w:t xml:space="preserve">, ezzel is </w:t>
-      </w:r>
-      <w:r>
-        <w:t>további adatbázis-szintű védelmet biztosítva</w:t>
-      </w:r>
-      <w:r>
-        <w:t xml:space="preserve"> a programomnak. </w:t>
-      </w:r>
-    </w:p>
-    <w:p>
-      <w:r>
-        <w:t xml:space="preserve">Továbbá a globális változóknál </w:t>
-      </w:r>
-      <w:r>
-        <w:t>Kulcs-Érték</w:t>
-      </w:r>
-      <w:r>
-        <w:t xml:space="preserve"> (</w:t>
-      </w:r>
-      <w:r>
-        <w:t>Key-Value</w:t>
-      </w:r>
-      <w:r>
-        <w:t>)</w:t>
-      </w:r>
-      <w:r>
-        <w:t xml:space="preserve"> adattárolási mint</w:t>
-      </w:r>
-      <w:r>
-        <w:t xml:space="preserve">át alkalmaztam. Így tehát például a </w:t>
-      </w:r>
-      <w:r>
-        <w:t xml:space="preserve">fűtés kapcsoló, </w:t>
-      </w:r>
-      <w:r>
-        <w:t xml:space="preserve">vagy a </w:t>
-      </w:r>
-      <w:r>
-        <w:t>telefonszám nem egyetlen sorból álló hagyományos táblában tárol</w:t>
-      </w:r>
-      <w:r>
-        <w:t>ódik</w:t>
-      </w:r>
-      <w:r>
-        <w:t>, hanem egy Key-Value struktúrájú site_settings táblában, ahol a key a PRIMARY KEY.</w:t>
-      </w:r>
-      <w:r>
-        <w:t xml:space="preserve"> Ez p</w:t>
-      </w:r>
-      <w:r>
-        <w:t xml:space="preserve">raktikus, ha új globális beállítást szeretnék a későbbiekben hozzáadni </w:t>
-      </w:r>
-      <w:r>
-        <w:t>–</w:t>
-      </w:r>
-      <w:r>
-        <w:t xml:space="preserve"> nem lesz szükség új egyéni</w:t>
-      </w:r>
-      <w:r>
-        <w:t xml:space="preserve"> oszlopra.</w:t>
-      </w:r>
-      <w:r>
-        <w:t xml:space="preserve"> Ennek megfelelő működéséhez a </w:t>
-      </w:r>
-      <w:r>
-        <w:t>SiteSetting modell konfigurációjában</w:t>
-      </w:r>
-      <w:r>
-        <w:t xml:space="preserve"> is explicit módon felül kellett írnom</w:t>
-      </w:r>
-      <w:r>
-        <w:t xml:space="preserve"> a keretrendszer alapértelmezett viselkedését</w:t>
-      </w:r>
-      <w:r>
-        <w:t xml:space="preserve">, máskülönben </w:t>
-      </w:r>
-      <w:r>
-        <w:t>az ORM hibás SQL lekérdezéseket generált volna</w:t>
-      </w:r>
-      <w:r>
-        <w:t xml:space="preserve">. </w:t>
-      </w:r>
-    </w:p>
-    <w:p>
-      <w:r>
-        <w:t>Mindemellett „</w:t>
-      </w:r>
-      <w:r>
-        <w:t>price_items</w:t>
-      </w:r>
-      <w:r>
-        <w:t>”</w:t>
-      </w:r>
-      <w:r>
-        <w:t xml:space="preserve"> és </w:t>
-      </w:r>
-      <w:r>
-        <w:t>„</w:t>
-      </w:r>
-      <w:r>
-        <w:t>gallery_images</w:t>
-      </w:r>
-      <w:r>
-        <w:t>”</w:t>
-      </w:r>
-      <w:r>
-        <w:t xml:space="preserve"> táblákban</w:t>
-      </w:r>
-      <w:r>
-        <w:t xml:space="preserve"> definiáltam egy</w:t>
-      </w:r>
-      <w:r>
-        <w:t xml:space="preserve"> </w:t>
-      </w:r>
-      <w:r>
-        <w:t>„</w:t>
-      </w:r>
-      <w:r>
-        <w:t>sort_order</w:t>
-      </w:r>
-      <w:r>
-        <w:t>”</w:t>
-      </w:r>
-      <w:r>
-        <w:t xml:space="preserve"> </w:t>
-      </w:r>
-      <w:r>
-        <w:t xml:space="preserve">nevű </w:t>
-      </w:r>
-      <w:r>
-        <w:t>attribútum</w:t>
-      </w:r>
-      <w:r>
-        <w:t xml:space="preserve">ot, ezzel szintén a jövőtűrő tervezést támogattam. </w:t>
-      </w:r>
-      <w:r>
-        <w:t>A későbbiekben ha egyik jobb képet előre szeretné</w:t>
-      </w:r>
-      <w:r>
-        <w:t>k</w:t>
-      </w:r>
-      <w:r>
-        <w:t xml:space="preserve"> hozni az oldalon, vagy egy új árat veszek fel, és nem a lista végére szeretném, akkor ennek segítségével lesz rendezhető a felsorolás</w:t>
-      </w:r>
-      <w:r>
-        <w:t>.</w:t>
+    </w:p>
+    <w:p>
+      <w:r>
+        <w:t>Mindemellett „price_items” és „gallery_images” táblákban definiáltam egy „sort_order” nevű attribútumot, ezzel szintén a jövőtűrő tervezést támogattam. A későbbiekben ha egyik jobb képet előre szeretnék hozni az oldalon, vagy egy új árat veszek fel, és nem a lista végére szeretném, akkor ennek segítségével lesz rendezhető a felsorolás.</w:t>
       </w:r>
     </w:p>
     <w:p>
@@ -9315,9 +9381,11 @@
       <w:pPr>
         <w:pStyle w:val="Cmsor3"/>
       </w:pPr>
+      <w:bookmarkStart w:id="44" w:name="_Toc226667822"/>
       <w:r>
         <w:t>Adatintegritás, GDPR és a törlési stratégiák</w:t>
       </w:r>
+      <w:bookmarkEnd w:id="44"/>
     </w:p>
     <w:p>
       <w:r>
@@ -9427,8 +9495,8 @@
       <w:pPr>
         <w:pStyle w:val="Cmsor1"/>
       </w:pPr>
-      <w:bookmarkStart w:id="43" w:name="_Toc226659197"/>
-      <w:commentRangeStart w:id="44"/>
+      <w:bookmarkStart w:id="45" w:name="_Toc226667823"/>
+      <w:commentRangeStart w:id="46"/>
       <w:r>
         <w:lastRenderedPageBreak/>
         <w:t>Összefoglalás és tovább</w:t>
@@ -9436,15 +9504,15 @@
       <w:r>
         <w:t>i fejlesztési lehetőségek</w:t>
       </w:r>
-      <w:bookmarkEnd w:id="43"/>
-      <w:commentRangeEnd w:id="44"/>
+      <w:bookmarkEnd w:id="45"/>
+      <w:commentRangeEnd w:id="46"/>
       <w:r>
         <w:rPr>
           <w:rStyle w:val="Jegyzethivatkozs"/>
           <w:sz w:val="32"/>
           <w:szCs w:val="32"/>
         </w:rPr>
-        <w:commentReference w:id="44"/>
+        <w:commentReference w:id="46"/>
       </w:r>
     </w:p>
     <w:p/>
@@ -9457,12 +9525,12 @@
       <w:pPr>
         <w:pStyle w:val="Cmsor1"/>
       </w:pPr>
-      <w:bookmarkStart w:id="45" w:name="_Toc226659198"/>
+      <w:bookmarkStart w:id="47" w:name="_Toc226667824"/>
       <w:r>
         <w:lastRenderedPageBreak/>
         <w:t>Irodalomjegyzék</w:t>
       </w:r>
-      <w:bookmarkEnd w:id="45"/>
+      <w:bookmarkEnd w:id="47"/>
     </w:p>
     <w:p>
       <w:pPr>
@@ -9487,21 +9555,21 @@
       <w:pPr>
         <w:pStyle w:val="Cmsor1"/>
       </w:pPr>
-      <w:bookmarkStart w:id="46" w:name="_Toc226659199"/>
-      <w:commentRangeStart w:id="47"/>
+      <w:bookmarkStart w:id="48" w:name="_Toc226667825"/>
+      <w:commentRangeStart w:id="49"/>
       <w:r>
         <w:lastRenderedPageBreak/>
         <w:t>Melléklet</w:t>
       </w:r>
-      <w:bookmarkEnd w:id="46"/>
-      <w:commentRangeEnd w:id="47"/>
+      <w:bookmarkEnd w:id="48"/>
+      <w:commentRangeEnd w:id="49"/>
       <w:r>
         <w:rPr>
           <w:rStyle w:val="Jegyzethivatkozs"/>
           <w:sz w:val="32"/>
           <w:szCs w:val="32"/>
         </w:rPr>
-        <w:commentReference w:id="47"/>
+        <w:commentReference w:id="49"/>
       </w:r>
     </w:p>
     <w:p>
@@ -9575,7 +9643,7 @@
       </w:r>
     </w:p>
   </w:comment>
-  <w:comment w:id="44" w:author="Németh Gábor Árpád Dr." w:date="2021-11-17T13:25:00Z" w:initials="NGÁD">
+  <w:comment w:id="46" w:author="Németh Gábor Árpád Dr." w:date="2021-11-17T13:25:00Z" w:initials="NGÁD">
     <w:p>
       <w:pPr>
         <w:pStyle w:val="Jegyzetszveg"/>
@@ -9606,7 +9674,7 @@
       </w:r>
     </w:p>
   </w:comment>
-  <w:comment w:id="47" w:author="Gludovátz Attila" w:date="2021-11-11T11:08:00Z" w:initials="GA">
+  <w:comment w:id="49" w:author="Gludovátz Attila" w:date="2021-11-11T11:08:00Z" w:initials="GA">
     <w:p>
       <w:pPr>
         <w:pStyle w:val="Jegyzetszveg"/>
@@ -10858,6 +10926,7 @@
   <w:style w:type="character" w:default="1" w:styleId="Bekezdsalapbettpusa">
     <w:name w:val="Default Paragraph Font"/>
     <w:uiPriority w:val="1"/>
+    <w:semiHidden/>
     <w:unhideWhenUsed/>
   </w:style>
   <w:style w:type="table" w:default="1" w:styleId="Normltblzat">
@@ -11837,16 +11906,16 @@
 </file>
 
 <file path=customXml/item2.xml><?xml version="1.0" encoding="utf-8"?>
-<b:Sources xmlns:b="http://schemas.openxmlformats.org/officeDocument/2006/bibliography" xmlns="http://schemas.openxmlformats.org/officeDocument/2006/bibliography" SelectedStyle="\APASixthEditionOfficeOnline.xsl" StyleName="APA" Version="6"/>
-</file>
-
-<file path=customXml/item3.xml><?xml version="1.0" encoding="utf-8"?>
 <?mso-contentType ?>
 <FormTemplates xmlns="http://schemas.microsoft.com/sharepoint/v3/contenttype/forms">
   <Display>DocumentLibraryForm</Display>
   <Edit>DocumentLibraryForm</Edit>
   <New>DocumentLibraryForm</New>
 </FormTemplates>
+</file>
+
+<file path=customXml/item3.xml><?xml version="1.0" encoding="utf-8"?>
+<b:Sources xmlns:b="http://schemas.openxmlformats.org/officeDocument/2006/bibliography" xmlns="http://schemas.openxmlformats.org/officeDocument/2006/bibliography" SelectedStyle="\APASixthEditionOfficeOnline.xsl" StyleName="APA" Version="6"/>
 </file>
 
 <file path=customXml/itemProps1.xml><?xml version="1.0" encoding="utf-8"?>
@@ -11868,17 +11937,17 @@
 </file>
 
 <file path=customXml/itemProps2.xml><?xml version="1.0" encoding="utf-8"?>
+<ds:datastoreItem xmlns:ds="http://schemas.openxmlformats.org/officeDocument/2006/customXml" ds:itemID="{79D0F40F-646A-4DBF-9119-0FC598DFBBBB}">
+  <ds:schemaRefs>
+    <ds:schemaRef ds:uri="http://schemas.microsoft.com/sharepoint/v3/contenttype/forms"/>
+  </ds:schemaRefs>
+</ds:datastoreItem>
+</file>
+
+<file path=customXml/itemProps3.xml><?xml version="1.0" encoding="utf-8"?>
 <ds:datastoreItem xmlns:ds="http://schemas.openxmlformats.org/officeDocument/2006/customXml" ds:itemID="{E9F6CDE2-636C-4043-AFFC-7CB0CE5DF55A}">
   <ds:schemaRefs>
     <ds:schemaRef ds:uri="http://schemas.openxmlformats.org/officeDocument/2006/bibliography"/>
   </ds:schemaRefs>
 </ds:datastoreItem>
-</file>
-
-<file path=customXml/itemProps3.xml><?xml version="1.0" encoding="utf-8"?>
-<ds:datastoreItem xmlns:ds="http://schemas.openxmlformats.org/officeDocument/2006/customXml" ds:itemID="{79D0F40F-646A-4DBF-9119-0FC598DFBBBB}">
-  <ds:schemaRefs>
-    <ds:schemaRef ds:uri="http://schemas.microsoft.com/sharepoint/v3/contenttype/forms"/>
-  </ds:schemaRefs>
-</ds:datastoreItem>
 </file>
</xml_diff>